<commit_message>
correction de la grande faille de securité en java, ajout de la suite du traitement du JwtToken, et de la suite de l'authentification en front et back
</commit_message>
<xml_diff>
--- a/Points critiques de sécurité à corriger/URGENT failles de sécurité importantes à corriger.docx
+++ b/Points critiques de sécurité à corriger/URGENT failles de sécurité importantes à corriger.docx
@@ -187,6 +187,7 @@
         </w:rPr>
         <w:t xml:space="preserve"> </w:t>
       </w:r>
+      <w:proofErr w:type="gramStart"/>
       <w:r>
         <w:rPr>
           <w:rFonts w:ascii="Calibri" w:hAnsi="Calibri" w:cs="Calibri"/>
@@ -196,7 +197,19 @@
           <w:sz w:val="44"/>
           <w:szCs w:val="44"/>
         </w:rPr>
-        <w:t>sur l’application actuelle</w:t>
+        <w:t>sur</w:t>
+      </w:r>
+      <w:proofErr w:type="gramEnd"/>
+      <w:r>
+        <w:rPr>
+          <w:rFonts w:ascii="Calibri" w:hAnsi="Calibri" w:cs="Calibri"/>
+          <w:b/>
+          <w:bCs/>
+          <w:color w:val="FFFFFF" w:themeColor="background1"/>
+          <w:sz w:val="44"/>
+          <w:szCs w:val="44"/>
+        </w:rPr>
+        <w:t xml:space="preserve"> l’application actuelle</w:t>
       </w:r>
     </w:p>
     <w:p>
@@ -266,7 +279,7 @@
           <w:sz w:val="40"/>
           <w:szCs w:val="40"/>
         </w:rPr>
-        <w:t xml:space="preserve"> points </w:t>
+        <w:t xml:space="preserve"> points importants</w:t>
       </w:r>
       <w:r>
         <w:rPr>
@@ -277,7 +290,7 @@
           <w:sz w:val="40"/>
           <w:szCs w:val="40"/>
         </w:rPr>
-        <w:t xml:space="preserve">très </w:t>
+        <w:t xml:space="preserve"> qui ne sont pas encore </w:t>
       </w:r>
       <w:r>
         <w:rPr>
@@ -288,7 +301,7 @@
           <w:sz w:val="40"/>
           <w:szCs w:val="40"/>
         </w:rPr>
-        <w:t>importants</w:t>
+        <w:t>corrigé dans l’application</w:t>
       </w:r>
       <w:r>
         <w:rPr>
@@ -299,28 +312,6 @@
           <w:sz w:val="40"/>
           <w:szCs w:val="40"/>
         </w:rPr>
-        <w:t xml:space="preserve"> qui ne sont pas encore </w:t>
-      </w:r>
-      <w:r>
-        <w:rPr>
-          <w:rFonts w:ascii="Calibri" w:hAnsi="Calibri" w:cs="Calibri"/>
-          <w:b/>
-          <w:bCs/>
-          <w:color w:val="C00000"/>
-          <w:sz w:val="40"/>
-          <w:szCs w:val="40"/>
-        </w:rPr>
-        <w:t>corrigé dans l’application</w:t>
-      </w:r>
-      <w:r>
-        <w:rPr>
-          <w:rFonts w:ascii="Calibri" w:hAnsi="Calibri" w:cs="Calibri"/>
-          <w:b/>
-          <w:bCs/>
-          <w:color w:val="C00000"/>
-          <w:sz w:val="40"/>
-          <w:szCs w:val="40"/>
-        </w:rPr>
         <w:t> :</w:t>
       </w:r>
     </w:p>
@@ -439,15 +430,6 @@
           <w:rFonts w:ascii="Calibri" w:hAnsi="Calibri" w:cs="Calibri"/>
           <w:b/>
           <w:bCs/>
-        </w:rPr>
-      </w:pPr>
-    </w:p>
-    <w:p>
-      <w:pPr>
-        <w:rPr>
-          <w:rFonts w:ascii="Calibri" w:hAnsi="Calibri" w:cs="Calibri"/>
-          <w:b/>
-          <w:bCs/>
           <w:color w:val="0070C0"/>
         </w:rPr>
       </w:pPr>
@@ -485,34 +467,7 @@
           <w:bCs/>
           <w:color w:val="0070C0"/>
         </w:rPr>
-        <w:t xml:space="preserve">le plus urgent à corriger </w:t>
-      </w:r>
-      <w:r>
-        <w:rPr>
-          <w:rFonts w:ascii="Calibri" w:hAnsi="Calibri" w:cs="Calibri"/>
-          <w:b/>
-          <w:bCs/>
-          <w:color w:val="0070C0"/>
-        </w:rPr>
-        <w:t>est avec le début</w:t>
-      </w:r>
-      <w:r>
-        <w:rPr>
-          <w:rFonts w:ascii="Calibri" w:hAnsi="Calibri" w:cs="Calibri"/>
-          <w:b/>
-          <w:bCs/>
-          <w:color w:val="0070C0"/>
-        </w:rPr>
-        <w:t xml:space="preserve"> </w:t>
-      </w:r>
-      <w:r>
-        <w:rPr>
-          <w:rFonts w:ascii="Calibri" w:hAnsi="Calibri" w:cs="Calibri"/>
-          <w:b/>
-          <w:bCs/>
-          <w:color w:val="0070C0"/>
-        </w:rPr>
-        <w:t>en rouge</w:t>
+        <w:t>le plus urgent à corriger</w:t>
       </w:r>
       <w:r>
         <w:rPr>
@@ -612,6 +567,7 @@
         </w:rPr>
         <w:t xml:space="preserve">(sans </w:t>
       </w:r>
+      <w:proofErr w:type="spellStart"/>
       <w:r>
         <w:rPr>
           <w:rFonts w:ascii="Calibri" w:hAnsi="Calibri" w:cs="Calibri"/>
@@ -622,7 +578,14 @@
         <w:rPr>
           <w:rFonts w:ascii="Calibri" w:hAnsi="Calibri" w:cs="Calibri"/>
         </w:rPr>
-        <w:t>oken J</w:t>
+        <w:t>oken</w:t>
+      </w:r>
+      <w:proofErr w:type="spellEnd"/>
+      <w:r>
+        <w:rPr>
+          <w:rFonts w:ascii="Calibri" w:hAnsi="Calibri" w:cs="Calibri"/>
+        </w:rPr>
+        <w:t xml:space="preserve"> J</w:t>
       </w:r>
       <w:r>
         <w:rPr>
@@ -688,7 +651,21 @@
         <w:rPr>
           <w:rFonts w:ascii="Calibri" w:hAnsi="Calibri" w:cs="Calibri"/>
         </w:rPr>
-        <w:t xml:space="preserve"> à leur compte (avec un Token JWT) </w:t>
+        <w:t xml:space="preserve"> à leur compte (avec un </w:t>
+      </w:r>
+      <w:proofErr w:type="spellStart"/>
+      <w:r>
+        <w:rPr>
+          <w:rFonts w:ascii="Calibri" w:hAnsi="Calibri" w:cs="Calibri"/>
+        </w:rPr>
+        <w:t>Token</w:t>
+      </w:r>
+      <w:proofErr w:type="spellEnd"/>
+      <w:r>
+        <w:rPr>
+          <w:rFonts w:ascii="Calibri" w:hAnsi="Calibri" w:cs="Calibri"/>
+        </w:rPr>
+        <w:t xml:space="preserve"> JWT) </w:t>
       </w:r>
       <w:r>
         <w:rPr>
@@ -723,9 +700,9 @@
     </w:p>
     <w:p>
       <w:pPr>
-        <w:rPr>
-          <w:rFonts w:ascii="Calibri" w:hAnsi="Calibri" w:cs="Calibri"/>
-          <w:color w:val="0070C0"/>
+        <w:pStyle w:val="Paragraphedeliste"/>
+        <w:rPr>
+          <w:rFonts w:ascii="Calibri" w:hAnsi="Calibri" w:cs="Calibri"/>
         </w:rPr>
       </w:pPr>
     </w:p>
@@ -743,343 +720,230 @@
       <w:r>
         <w:rPr>
           <w:rFonts w:ascii="Calibri" w:hAnsi="Calibri" w:cs="Calibri"/>
-          <w:color w:val="C00000"/>
-        </w:rPr>
-        <w:t xml:space="preserve">Dans le fichier </w:t>
-      </w:r>
-      <w:r>
-        <w:rPr>
-          <w:rFonts w:ascii="Calibri" w:hAnsi="Calibri" w:cs="Calibri"/>
-          <w:color w:val="C00000"/>
+        </w:rPr>
+        <w:t xml:space="preserve">Dans </w:t>
+      </w:r>
+      <w:r>
+        <w:rPr>
+          <w:rFonts w:ascii="Calibri" w:hAnsi="Calibri" w:cs="Calibri"/>
+        </w:rPr>
+        <w:t xml:space="preserve">le </w:t>
+      </w:r>
+      <w:r>
+        <w:rPr>
+          <w:rFonts w:ascii="Calibri" w:hAnsi="Calibri" w:cs="Calibri"/>
+        </w:rPr>
+        <w:t xml:space="preserve">fichier </w:t>
+      </w:r>
+      <w:r>
+        <w:rPr>
+          <w:rFonts w:ascii="Calibri" w:hAnsi="Calibri" w:cs="Calibri"/>
           <w:u w:val="single"/>
         </w:rPr>
-        <w:t>service/ServiceCouche.java</w:t>
-      </w:r>
-      <w:r>
-        <w:rPr>
-          <w:rFonts w:ascii="Calibri" w:hAnsi="Calibri" w:cs="Calibri"/>
-          <w:color w:val="C00000"/>
+        <w:t>service/serviceUser</w:t>
+      </w:r>
+      <w:r>
+        <w:rPr>
+          <w:rFonts w:ascii="Calibri" w:hAnsi="Calibri" w:cs="Calibri"/>
           <w:u w:val="single"/>
         </w:rPr>
+        <w:t>.java</w:t>
+      </w:r>
+      <w:r>
+        <w:rPr>
+          <w:rFonts w:ascii="Calibri" w:hAnsi="Calibri" w:cs="Calibri"/>
+        </w:rPr>
+        <w:t xml:space="preserve"> à la ligne 82 environ</w:t>
+      </w:r>
+      <w:r>
+        <w:rPr>
+          <w:rFonts w:ascii="Calibri" w:hAnsi="Calibri" w:cs="Calibri"/>
+        </w:rPr>
+        <w:t xml:space="preserve">, </w:t>
+      </w:r>
+      <w:r>
+        <w:rPr>
+          <w:rFonts w:ascii="Calibri" w:hAnsi="Calibri" w:cs="Calibri"/>
+        </w:rPr>
+        <w:t>u</w:t>
+      </w:r>
+      <w:r>
+        <w:rPr>
+          <w:rFonts w:ascii="Calibri" w:hAnsi="Calibri" w:cs="Calibri"/>
+        </w:rPr>
+        <w:t>ne</w:t>
+      </w:r>
+      <w:r>
+        <w:rPr>
+          <w:rFonts w:ascii="Calibri" w:hAnsi="Calibri" w:cs="Calibri"/>
+        </w:rPr>
+        <w:t xml:space="preserve"> fois que la personne </w:t>
+      </w:r>
+      <w:r>
+        <w:rPr>
+          <w:rFonts w:ascii="Calibri" w:hAnsi="Calibri" w:cs="Calibri"/>
+        </w:rPr>
+        <w:t>valide la connexion</w:t>
+      </w:r>
+      <w:r>
+        <w:rPr>
+          <w:rFonts w:ascii="Calibri" w:hAnsi="Calibri" w:cs="Calibri"/>
+        </w:rPr>
+        <w:t xml:space="preserve"> à son compte</w:t>
+      </w:r>
+      <w:r>
+        <w:rPr>
+          <w:rFonts w:ascii="Calibri" w:hAnsi="Calibri" w:cs="Calibri"/>
+        </w:rPr>
+        <w:t xml:space="preserve">, </w:t>
+      </w:r>
+      <w:r>
+        <w:rPr>
+          <w:rFonts w:ascii="Calibri" w:hAnsi="Calibri" w:cs="Calibri"/>
+        </w:rPr>
+        <w:t xml:space="preserve">la fonction </w:t>
+      </w:r>
+      <w:proofErr w:type="spellStart"/>
+      <w:proofErr w:type="gramStart"/>
+      <w:r>
+        <w:rPr>
+          <w:rFonts w:ascii="Calibri" w:hAnsi="Calibri" w:cs="Calibri"/>
+          <w:b/>
+          <w:bCs/>
+        </w:rPr>
+        <w:t>connectionCompte</w:t>
+      </w:r>
+      <w:proofErr w:type="spellEnd"/>
+      <w:r>
+        <w:rPr>
+          <w:rFonts w:ascii="Calibri" w:hAnsi="Calibri" w:cs="Calibri"/>
+          <w:b/>
+          <w:bCs/>
+        </w:rPr>
+        <w:t>(</w:t>
+      </w:r>
+      <w:proofErr w:type="gramEnd"/>
+      <w:r>
+        <w:rPr>
+          <w:rFonts w:ascii="Calibri" w:hAnsi="Calibri" w:cs="Calibri"/>
+          <w:b/>
+          <w:bCs/>
+        </w:rPr>
+        <w:t>)</w:t>
+      </w:r>
+      <w:r>
+        <w:rPr>
+          <w:rFonts w:ascii="Calibri" w:hAnsi="Calibri" w:cs="Calibri"/>
+        </w:rPr>
         <w:t xml:space="preserve"> </w:t>
       </w:r>
       <w:r>
         <w:rPr>
           <w:rFonts w:ascii="Calibri" w:hAnsi="Calibri" w:cs="Calibri"/>
-          <w:color w:val="C00000"/>
-        </w:rPr>
-        <w:t xml:space="preserve">à la ligne </w:t>
-      </w:r>
-      <w:r>
-        <w:rPr>
-          <w:rFonts w:ascii="Calibri" w:hAnsi="Calibri" w:cs="Calibri"/>
-          <w:color w:val="C00000"/>
-        </w:rPr>
-        <w:t>55 environ</w:t>
-      </w:r>
-      <w:r>
-        <w:rPr>
-          <w:rFonts w:ascii="Calibri" w:hAnsi="Calibri" w:cs="Calibri"/>
-        </w:rPr>
-        <w:t xml:space="preserve">, </w:t>
-      </w:r>
-      <w:r>
-        <w:rPr>
-          <w:rFonts w:ascii="Calibri" w:hAnsi="Calibri" w:cs="Calibri"/>
-        </w:rPr>
-        <w:t xml:space="preserve">la fonction </w:t>
-      </w:r>
-      <w:r>
-        <w:rPr>
-          <w:rFonts w:ascii="Calibri" w:hAnsi="Calibri" w:cs="Calibri"/>
-        </w:rPr>
-        <w:t xml:space="preserve">récupère le contenu du nom de la table passé </w:t>
-      </w:r>
-      <w:r>
-        <w:rPr>
-          <w:rFonts w:ascii="Calibri" w:hAnsi="Calibri" w:cs="Calibri"/>
-        </w:rPr>
-        <w:t xml:space="preserve">en paramètre, qui est </w:t>
-      </w:r>
-      <w:r>
-        <w:rPr>
-          <w:rFonts w:ascii="Calibri" w:hAnsi="Calibri" w:cs="Calibri"/>
-        </w:rPr>
-        <w:t>récupéré</w:t>
-      </w:r>
-      <w:r>
-        <w:rPr>
-          <w:rFonts w:ascii="Calibri" w:hAnsi="Calibri" w:cs="Calibri"/>
-        </w:rPr>
-        <w:t xml:space="preserve"> dans l’url. </w:t>
-      </w:r>
-      <w:r>
-        <w:rPr>
-          <w:rFonts w:ascii="Calibri" w:hAnsi="Calibri" w:cs="Calibri"/>
-        </w:rPr>
-        <w:t xml:space="preserve">Mais aucune vérification n’est </w:t>
-      </w:r>
-      <w:r>
-        <w:rPr>
-          <w:rFonts w:ascii="Calibri" w:hAnsi="Calibri" w:cs="Calibri"/>
-        </w:rPr>
-        <w:t>faite</w:t>
-      </w:r>
-      <w:r>
-        <w:rPr>
-          <w:rFonts w:ascii="Calibri" w:hAnsi="Calibri" w:cs="Calibri"/>
-        </w:rPr>
-        <w:t xml:space="preserve"> sur le nom de la table envoyé</w:t>
-      </w:r>
-      <w:r>
-        <w:rPr>
-          <w:rFonts w:ascii="Calibri" w:hAnsi="Calibri" w:cs="Calibri"/>
-        </w:rPr>
-        <w:t xml:space="preserve">, et la requête SQL est exécuté directement avec le nom de table. </w:t>
-      </w:r>
-      <w:r>
-        <w:rPr>
-          <w:rFonts w:ascii="Calibri" w:hAnsi="Calibri" w:cs="Calibri"/>
-        </w:rPr>
-        <w:t xml:space="preserve">Par conséquent si </w:t>
-      </w:r>
-      <w:r>
-        <w:rPr>
-          <w:rFonts w:ascii="Calibri" w:hAnsi="Calibri" w:cs="Calibri"/>
-        </w:rPr>
-        <w:t xml:space="preserve">un utilisateur met du code </w:t>
-      </w:r>
-      <w:r>
-        <w:rPr>
-          <w:rFonts w:ascii="Calibri" w:hAnsi="Calibri" w:cs="Calibri"/>
-        </w:rPr>
-        <w:t>SQL</w:t>
-      </w:r>
-      <w:r>
-        <w:rPr>
-          <w:rFonts w:ascii="Calibri" w:hAnsi="Calibri" w:cs="Calibri"/>
-        </w:rPr>
-        <w:t xml:space="preserve"> malveillant à la place du nom de la table à récupérer, </w:t>
-      </w:r>
-      <w:r>
-        <w:rPr>
-          <w:rFonts w:ascii="Calibri" w:hAnsi="Calibri" w:cs="Calibri"/>
-        </w:rPr>
-        <w:t xml:space="preserve">celui-ci sera exécuté dans la base de </w:t>
-      </w:r>
-      <w:r>
-        <w:rPr>
-          <w:rFonts w:ascii="Calibri" w:hAnsi="Calibri" w:cs="Calibri"/>
-        </w:rPr>
-        <w:t>données</w:t>
-      </w:r>
-      <w:r>
-        <w:rPr>
-          <w:rFonts w:ascii="Calibri" w:hAnsi="Calibri" w:cs="Calibri"/>
-        </w:rPr>
-        <w:t>. Par conséquent avant d’exécuter la requête SQL, il faut obligatoirement ajouter une vérification afin de s’assurer que le nom de la table</w:t>
-      </w:r>
-      <w:r>
-        <w:rPr>
-          <w:rFonts w:ascii="Calibri" w:hAnsi="Calibri" w:cs="Calibri"/>
-        </w:rPr>
-        <w:t xml:space="preserve"> à récupérer existe bien dans la base de données.</w:t>
+        </w:rPr>
+        <w:t>retourne un Boolean qui vaut True, à la place de retourner un</w:t>
+      </w:r>
+      <w:r>
+        <w:rPr>
+          <w:rFonts w:ascii="Calibri" w:hAnsi="Calibri" w:cs="Calibri"/>
+        </w:rPr>
+        <w:t xml:space="preserve"> </w:t>
+      </w:r>
+      <w:proofErr w:type="spellStart"/>
+      <w:r>
+        <w:rPr>
+          <w:rFonts w:ascii="Calibri" w:hAnsi="Calibri" w:cs="Calibri"/>
+        </w:rPr>
+        <w:t>Token</w:t>
+      </w:r>
+      <w:proofErr w:type="spellEnd"/>
+      <w:r>
+        <w:rPr>
+          <w:rFonts w:ascii="Calibri" w:hAnsi="Calibri" w:cs="Calibri"/>
+        </w:rPr>
+        <w:t xml:space="preserve"> JWT</w:t>
+      </w:r>
+      <w:r>
+        <w:rPr>
+          <w:rFonts w:ascii="Calibri" w:hAnsi="Calibri" w:cs="Calibri"/>
+        </w:rPr>
+        <w:t xml:space="preserve">. De même aucune fonction n’a été </w:t>
+      </w:r>
+      <w:r>
+        <w:rPr>
+          <w:rFonts w:ascii="Calibri" w:hAnsi="Calibri" w:cs="Calibri"/>
+        </w:rPr>
+        <w:t>développé</w:t>
+      </w:r>
+      <w:r>
+        <w:rPr>
+          <w:rFonts w:ascii="Calibri" w:hAnsi="Calibri" w:cs="Calibri"/>
+        </w:rPr>
+        <w:t xml:space="preserve"> pour valider si le </w:t>
+      </w:r>
+      <w:proofErr w:type="spellStart"/>
+      <w:r>
+        <w:rPr>
+          <w:rFonts w:ascii="Calibri" w:hAnsi="Calibri" w:cs="Calibri"/>
+        </w:rPr>
+        <w:t>Token</w:t>
+      </w:r>
+      <w:proofErr w:type="spellEnd"/>
+      <w:r>
+        <w:rPr>
+          <w:rFonts w:ascii="Calibri" w:hAnsi="Calibri" w:cs="Calibri"/>
+        </w:rPr>
+        <w:t xml:space="preserve"> JWT </w:t>
+      </w:r>
+      <w:r>
+        <w:rPr>
+          <w:rFonts w:ascii="Calibri" w:hAnsi="Calibri" w:cs="Calibri"/>
+        </w:rPr>
+        <w:t>reçu est valide ou pas.</w:t>
+      </w:r>
+      <w:r>
+        <w:rPr>
+          <w:rFonts w:ascii="Calibri" w:hAnsi="Calibri" w:cs="Calibri"/>
+        </w:rPr>
+        <w:t xml:space="preserve"> Et sans ces </w:t>
+      </w:r>
+      <w:r>
+        <w:rPr>
+          <w:rFonts w:ascii="Calibri" w:hAnsi="Calibri" w:cs="Calibri"/>
+        </w:rPr>
+        <w:t>deux fonctionnalités l’authentification à un compte n</w:t>
+      </w:r>
+      <w:r>
+        <w:rPr>
+          <w:rFonts w:ascii="Calibri" w:hAnsi="Calibri" w:cs="Calibri"/>
+        </w:rPr>
+        <w:t>e peut pas fonctionner</w:t>
+      </w:r>
+      <w:r>
+        <w:rPr>
+          <w:rFonts w:ascii="Calibri" w:hAnsi="Calibri" w:cs="Calibri"/>
+        </w:rPr>
+        <w:t xml:space="preserve"> correctement</w:t>
+      </w:r>
+      <w:r>
+        <w:rPr>
+          <w:rFonts w:ascii="Calibri" w:hAnsi="Calibri" w:cs="Calibri"/>
+        </w:rPr>
+        <w:t>.</w:t>
       </w:r>
     </w:p>
     <w:p>
       <w:pPr>
-        <w:pStyle w:val="Paragraphedeliste"/>
-        <w:rPr>
-          <w:rFonts w:ascii="Calibri" w:hAnsi="Calibri" w:cs="Calibri"/>
+        <w:rPr>
+          <w:rFonts w:ascii="Calibri" w:hAnsi="Calibri" w:cs="Calibri"/>
+          <w:b/>
+          <w:bCs/>
+          <w:color w:val="0070C0"/>
         </w:rPr>
       </w:pPr>
     </w:p>
     <w:p>
       <w:pPr>
-        <w:pStyle w:val="Paragraphedeliste"/>
-        <w:numPr>
-          <w:ilvl w:val="0"/>
-          <w:numId w:val="9"/>
-        </w:numPr>
-        <w:rPr>
-          <w:rFonts w:ascii="Calibri" w:hAnsi="Calibri" w:cs="Calibri"/>
-        </w:rPr>
-      </w:pPr>
-      <w:r>
-        <w:rPr>
-          <w:rFonts w:ascii="Calibri" w:hAnsi="Calibri" w:cs="Calibri"/>
-        </w:rPr>
-        <w:t xml:space="preserve">Dans </w:t>
-      </w:r>
-      <w:r>
-        <w:rPr>
-          <w:rFonts w:ascii="Calibri" w:hAnsi="Calibri" w:cs="Calibri"/>
-        </w:rPr>
-        <w:t xml:space="preserve">le </w:t>
-      </w:r>
-      <w:r>
-        <w:rPr>
-          <w:rFonts w:ascii="Calibri" w:hAnsi="Calibri" w:cs="Calibri"/>
-        </w:rPr>
-        <w:t xml:space="preserve">fichier </w:t>
-      </w:r>
-      <w:r>
-        <w:rPr>
-          <w:rFonts w:ascii="Calibri" w:hAnsi="Calibri" w:cs="Calibri"/>
-          <w:u w:val="single"/>
-        </w:rPr>
-        <w:t>service/serviceUser</w:t>
-      </w:r>
-      <w:r>
-        <w:rPr>
-          <w:rFonts w:ascii="Calibri" w:hAnsi="Calibri" w:cs="Calibri"/>
-          <w:u w:val="single"/>
-        </w:rPr>
-        <w:t>.java</w:t>
-      </w:r>
-      <w:r>
-        <w:rPr>
-          <w:rFonts w:ascii="Calibri" w:hAnsi="Calibri" w:cs="Calibri"/>
-        </w:rPr>
-        <w:t xml:space="preserve"> à la ligne 82 environ</w:t>
-      </w:r>
-      <w:r>
-        <w:rPr>
-          <w:rFonts w:ascii="Calibri" w:hAnsi="Calibri" w:cs="Calibri"/>
-        </w:rPr>
-        <w:t xml:space="preserve">, </w:t>
-      </w:r>
-      <w:r>
-        <w:rPr>
-          <w:rFonts w:ascii="Calibri" w:hAnsi="Calibri" w:cs="Calibri"/>
-        </w:rPr>
-        <w:t>u</w:t>
-      </w:r>
-      <w:r>
-        <w:rPr>
-          <w:rFonts w:ascii="Calibri" w:hAnsi="Calibri" w:cs="Calibri"/>
-        </w:rPr>
-        <w:t>ne</w:t>
-      </w:r>
-      <w:r>
-        <w:rPr>
-          <w:rFonts w:ascii="Calibri" w:hAnsi="Calibri" w:cs="Calibri"/>
-        </w:rPr>
-        <w:t xml:space="preserve"> fois que la personne </w:t>
-      </w:r>
-      <w:r>
-        <w:rPr>
-          <w:rFonts w:ascii="Calibri" w:hAnsi="Calibri" w:cs="Calibri"/>
-        </w:rPr>
-        <w:t>valide la connexion</w:t>
-      </w:r>
-      <w:r>
-        <w:rPr>
-          <w:rFonts w:ascii="Calibri" w:hAnsi="Calibri" w:cs="Calibri"/>
-        </w:rPr>
-        <w:t xml:space="preserve"> à son compte</w:t>
-      </w:r>
-      <w:r>
-        <w:rPr>
-          <w:rFonts w:ascii="Calibri" w:hAnsi="Calibri" w:cs="Calibri"/>
-        </w:rPr>
-        <w:t xml:space="preserve">, </w:t>
-      </w:r>
-      <w:r>
-        <w:rPr>
-          <w:rFonts w:ascii="Calibri" w:hAnsi="Calibri" w:cs="Calibri"/>
-        </w:rPr>
-        <w:t xml:space="preserve">la fonction </w:t>
-      </w:r>
-      <w:r>
-        <w:rPr>
-          <w:rFonts w:ascii="Calibri" w:hAnsi="Calibri" w:cs="Calibri"/>
-          <w:b/>
-          <w:bCs/>
-        </w:rPr>
-        <w:t>connectionCompte()</w:t>
-      </w:r>
-      <w:r>
-        <w:rPr>
-          <w:rFonts w:ascii="Calibri" w:hAnsi="Calibri" w:cs="Calibri"/>
-        </w:rPr>
-        <w:t xml:space="preserve"> </w:t>
-      </w:r>
-      <w:r>
-        <w:rPr>
-          <w:rFonts w:ascii="Calibri" w:hAnsi="Calibri" w:cs="Calibri"/>
-        </w:rPr>
-        <w:t>retourne un Boolean qui vaut True, à la place de retourner un</w:t>
-      </w:r>
-      <w:r>
-        <w:rPr>
-          <w:rFonts w:ascii="Calibri" w:hAnsi="Calibri" w:cs="Calibri"/>
-        </w:rPr>
-        <w:t xml:space="preserve"> Token</w:t>
-      </w:r>
-      <w:r>
-        <w:rPr>
-          <w:rFonts w:ascii="Calibri" w:hAnsi="Calibri" w:cs="Calibri"/>
-        </w:rPr>
-        <w:t xml:space="preserve"> JWT</w:t>
-      </w:r>
-      <w:r>
-        <w:rPr>
-          <w:rFonts w:ascii="Calibri" w:hAnsi="Calibri" w:cs="Calibri"/>
-        </w:rPr>
-        <w:t xml:space="preserve">. De même aucune fonction n’a été </w:t>
-      </w:r>
-      <w:r>
-        <w:rPr>
-          <w:rFonts w:ascii="Calibri" w:hAnsi="Calibri" w:cs="Calibri"/>
-        </w:rPr>
-        <w:t>développé</w:t>
-      </w:r>
-      <w:r>
-        <w:rPr>
-          <w:rFonts w:ascii="Calibri" w:hAnsi="Calibri" w:cs="Calibri"/>
-        </w:rPr>
-        <w:t xml:space="preserve"> pour valider si le Token JWT </w:t>
-      </w:r>
-      <w:r>
-        <w:rPr>
-          <w:rFonts w:ascii="Calibri" w:hAnsi="Calibri" w:cs="Calibri"/>
-        </w:rPr>
-        <w:t>reçu est valide ou pas.</w:t>
-      </w:r>
-      <w:r>
-        <w:rPr>
-          <w:rFonts w:ascii="Calibri" w:hAnsi="Calibri" w:cs="Calibri"/>
-        </w:rPr>
-        <w:t xml:space="preserve"> Et sans ces </w:t>
-      </w:r>
-      <w:r>
-        <w:rPr>
-          <w:rFonts w:ascii="Calibri" w:hAnsi="Calibri" w:cs="Calibri"/>
-        </w:rPr>
-        <w:t>deux fonctionnalités l’authentification à un compte n</w:t>
-      </w:r>
-      <w:r>
-        <w:rPr>
-          <w:rFonts w:ascii="Calibri" w:hAnsi="Calibri" w:cs="Calibri"/>
-        </w:rPr>
-        <w:t>e peut pas fonctionner</w:t>
-      </w:r>
-      <w:r>
-        <w:rPr>
-          <w:rFonts w:ascii="Calibri" w:hAnsi="Calibri" w:cs="Calibri"/>
-        </w:rPr>
-        <w:t xml:space="preserve"> correctement</w:t>
-      </w:r>
-      <w:r>
-        <w:rPr>
-          <w:rFonts w:ascii="Calibri" w:hAnsi="Calibri" w:cs="Calibri"/>
-        </w:rPr>
-        <w:t>.</w:t>
-      </w:r>
-    </w:p>
-    <w:p>
-      <w:pPr>
         <w:rPr>
           <w:rFonts w:ascii="Calibri" w:hAnsi="Calibri" w:cs="Calibri"/>
           <w:b/>
@@ -1094,7 +958,6 @@
           <w:bCs/>
           <w:color w:val="0070C0"/>
         </w:rPr>
-        <w:lastRenderedPageBreak/>
         <w:t>Dans le code frontend</w:t>
       </w:r>
       <w:r>
@@ -1133,15 +996,6 @@
         </w:rPr>
         <w:t>urgent à corriger)</w:t>
       </w:r>
-    </w:p>
-    <w:p>
-      <w:pPr>
-        <w:rPr>
-          <w:rFonts w:ascii="Calibri" w:hAnsi="Calibri" w:cs="Calibri"/>
-          <w:b/>
-          <w:bCs/>
-        </w:rPr>
-      </w:pPr>
     </w:p>
     <w:p>
       <w:pPr>
@@ -1182,7 +1036,28 @@
         <w:rPr>
           <w:rFonts w:ascii="Calibri" w:hAnsi="Calibri" w:cs="Calibri"/>
         </w:rPr>
-        <w:t xml:space="preserve"> (donc sans Token JWT stocké dans le LocalS</w:t>
+        <w:t xml:space="preserve"> (donc sans </w:t>
+      </w:r>
+      <w:proofErr w:type="spellStart"/>
+      <w:r>
+        <w:rPr>
+          <w:rFonts w:ascii="Calibri" w:hAnsi="Calibri" w:cs="Calibri"/>
+        </w:rPr>
+        <w:t>Token</w:t>
+      </w:r>
+      <w:proofErr w:type="spellEnd"/>
+      <w:r>
+        <w:rPr>
+          <w:rFonts w:ascii="Calibri" w:hAnsi="Calibri" w:cs="Calibri"/>
+        </w:rPr>
+        <w:t xml:space="preserve"> JWT stocké dans le </w:t>
+      </w:r>
+      <w:proofErr w:type="spellStart"/>
+      <w:r>
+        <w:rPr>
+          <w:rFonts w:ascii="Calibri" w:hAnsi="Calibri" w:cs="Calibri"/>
+        </w:rPr>
+        <w:t>LocalS</w:t>
       </w:r>
       <w:r>
         <w:rPr>
@@ -1194,7 +1069,14 @@
         <w:rPr>
           <w:rFonts w:ascii="Calibri" w:hAnsi="Calibri" w:cs="Calibri"/>
         </w:rPr>
-        <w:t>orage)</w:t>
+        <w:t>orage</w:t>
+      </w:r>
+      <w:proofErr w:type="spellEnd"/>
+      <w:r>
+        <w:rPr>
+          <w:rFonts w:ascii="Calibri" w:hAnsi="Calibri" w:cs="Calibri"/>
+        </w:rPr>
+        <w:t>)</w:t>
       </w:r>
       <w:r>
         <w:rPr>
@@ -1244,6 +1126,7 @@
         </w:rPr>
         <w:t xml:space="preserve"> un </w:t>
       </w:r>
+      <w:proofErr w:type="spellStart"/>
       <w:r>
         <w:rPr>
           <w:rFonts w:ascii="Calibri" w:hAnsi="Calibri" w:cs="Calibri"/>
@@ -1268,6 +1151,7 @@
         </w:rPr>
         <w:t>.ts</w:t>
       </w:r>
+      <w:proofErr w:type="spellEnd"/>
       <w:r>
         <w:rPr>
           <w:rFonts w:ascii="Calibri" w:hAnsi="Calibri" w:cs="Calibri"/>
@@ -1278,7 +1162,21 @@
         <w:rPr>
           <w:rFonts w:ascii="Calibri" w:hAnsi="Calibri" w:cs="Calibri"/>
         </w:rPr>
-        <w:t xml:space="preserve">en Angular qui </w:t>
+        <w:t xml:space="preserve">en </w:t>
+      </w:r>
+      <w:proofErr w:type="spellStart"/>
+      <w:r>
+        <w:rPr>
+          <w:rFonts w:ascii="Calibri" w:hAnsi="Calibri" w:cs="Calibri"/>
+        </w:rPr>
+        <w:t>Angular</w:t>
+      </w:r>
+      <w:proofErr w:type="spellEnd"/>
+      <w:r>
+        <w:rPr>
+          <w:rFonts w:ascii="Calibri" w:hAnsi="Calibri" w:cs="Calibri"/>
+        </w:rPr>
+        <w:t xml:space="preserve"> qui </w:t>
       </w:r>
       <w:r>
         <w:rPr>
@@ -1302,13 +1200,41 @@
         <w:rPr>
           <w:rFonts w:ascii="Calibri" w:hAnsi="Calibri" w:cs="Calibri"/>
         </w:rPr>
-        <w:t xml:space="preserve">si un Token JWT </w:t>
-      </w:r>
-      <w:r>
-        <w:rPr>
-          <w:rFonts w:ascii="Calibri" w:hAnsi="Calibri" w:cs="Calibri"/>
-        </w:rPr>
-        <w:t>existe dans le LocalStorage de l’utilisateur. Si oui</w:t>
+        <w:t xml:space="preserve">si un </w:t>
+      </w:r>
+      <w:proofErr w:type="spellStart"/>
+      <w:r>
+        <w:rPr>
+          <w:rFonts w:ascii="Calibri" w:hAnsi="Calibri" w:cs="Calibri"/>
+        </w:rPr>
+        <w:t>Token</w:t>
+      </w:r>
+      <w:proofErr w:type="spellEnd"/>
+      <w:r>
+        <w:rPr>
+          <w:rFonts w:ascii="Calibri" w:hAnsi="Calibri" w:cs="Calibri"/>
+        </w:rPr>
+        <w:t xml:space="preserve"> JWT </w:t>
+      </w:r>
+      <w:r>
+        <w:rPr>
+          <w:rFonts w:ascii="Calibri" w:hAnsi="Calibri" w:cs="Calibri"/>
+        </w:rPr>
+        <w:t xml:space="preserve">existe dans le </w:t>
+      </w:r>
+      <w:proofErr w:type="spellStart"/>
+      <w:r>
+        <w:rPr>
+          <w:rFonts w:ascii="Calibri" w:hAnsi="Calibri" w:cs="Calibri"/>
+        </w:rPr>
+        <w:t>LocalStorage</w:t>
+      </w:r>
+      <w:proofErr w:type="spellEnd"/>
+      <w:r>
+        <w:rPr>
+          <w:rFonts w:ascii="Calibri" w:hAnsi="Calibri" w:cs="Calibri"/>
+        </w:rPr>
+        <w:t xml:space="preserve"> de l’utilisateur. Si oui</w:t>
       </w:r>
       <w:r>
         <w:rPr>
@@ -1352,13 +1278,23 @@
         </w:rPr>
         <w:t xml:space="preserve">signifie qu’il n’est pas connecté et dans ce cas le </w:t>
       </w:r>
-      <w:r>
-        <w:rPr>
-          <w:rFonts w:ascii="Calibri" w:hAnsi="Calibri" w:cs="Calibri"/>
-          <w:b/>
-          <w:bCs/>
-        </w:rPr>
-        <w:t xml:space="preserve">guard.ts </w:t>
+      <w:proofErr w:type="spellStart"/>
+      <w:r>
+        <w:rPr>
+          <w:rFonts w:ascii="Calibri" w:hAnsi="Calibri" w:cs="Calibri"/>
+          <w:b/>
+          <w:bCs/>
+        </w:rPr>
+        <w:t>guard.ts</w:t>
+      </w:r>
+      <w:proofErr w:type="spellEnd"/>
+      <w:r>
+        <w:rPr>
+          <w:rFonts w:ascii="Calibri" w:hAnsi="Calibri" w:cs="Calibri"/>
+          <w:b/>
+          <w:bCs/>
+        </w:rPr>
+        <w:t xml:space="preserve"> </w:t>
       </w:r>
       <w:r>
         <w:rPr>

</xml_diff>